<commit_message>
Add LinkedIn URL to DeShawn Wilson resume header
</commit_message>
<xml_diff>
--- a/DeShawn_Wilson_Resume.docx
+++ b/DeShawn_Wilson_Resume.docx
@@ -38,7 +38,7 @@
         <w:rPr>
           <w:sz w:val="19"/>
         </w:rPr>
-        <w:t>Austin, TX (Remote)  |  deshawnwilson.ai  |  GitHub: github.com/deshawnwilson-ai</w:t>
+        <w:t>Austin, TX (Remote)  |  deshawnwilson.ai</w:t>
       </w:r>
     </w:p>
     <w:p>
@@ -48,11 +48,9 @@
       </w:pPr>
       <w:r>
         <w:rPr>
-          <w:i/>
-          <w:color w:val="444444"/>
           <w:sz w:val="19"/>
         </w:rPr>
-        <w:t>Full LinkedIn profile available upon request</w:t>
+        <w:t>LinkedIn: linkedin.com/in/deshawn-wilson-ai  |  GitHub: github.com/deshawnwilson-ai</w:t>
       </w:r>
     </w:p>
     <w:p>

</xml_diff>